<commit_message>
Caso laboral K. Carmona: causas alineadas, prueba de lo verbal y cargas sociales
- Registros: expresiones verbales contra la Dirección (R-038, pendiente de
  prueba), puntualidad (R-039) y solicitud de Fiorella sin cargas sociales
  (R-040). Normas N-025 a N-028. Evaluaciones E-007 y E-008.
- Documento nuevo: causas del art. 81 ordenadas por alineación, prueba
  lícita de conductas verbales y respuesta sobre cargas sociales.
- Plan: la sección 4.3 incluye el trato respetuoso hacia la Dirección y la
  clínica, también en su ausencia.

Co-Authored-By: Claude Opus 5.5 <noreply@anthropic.com>
Claude-Session: https://claude.ai/code/session_01V7BfzBTA8TEWMK1apGBBKC
</commit_message>
<xml_diff>
--- a/casos/laboral-kcarmona/escritos/2026-10-25_Plan_de_Mejora_KCarmona.docx
+++ b/casos/laboral-kcarmona/escritos/2026-10-25_Plan_de_Mejora_KCarmona.docx
@@ -1267,6 +1267,21 @@
           <w:sz w:val="21"/>
         </w:rPr>
         <w:t>Las situaciones personales o de desempeño de otras personas del equipo no se comentan en su ausencia.</w:t>
+      </w:r>
+    </w:p>
+    <w:p>
+      <w:pPr>
+        <w:pStyle w:val="ListBullet"/>
+        <w:spacing w:before="0" w:after="60" w:line="300" w:lineRule="auto"/>
+      </w:pPr>
+      <w:r>
+        <w:rPr>
+          <w:rFonts w:ascii="Georgia" w:hAnsi="Georgia"/>
+          <w:b w:val="0"/>
+          <w:color w:val="2F2E47"/>
+          <w:sz w:val="21"/>
+        </w:rPr>
+        <w:t>Las referencias a la Dirección, a la jefatura y a la clínica, también en su ausencia, se expresan con respeto, sin descalificaciones ni expresiones ofensivas. Las inconformidades se plantean por el canal de la sección 4.2.</w:t>
       </w:r>
     </w:p>
     <w:p>

</xml_diff>

<commit_message>
Caso laboral K. Carmona: comunicado listo para firma y corrección del nombre
- Comunicado revisado línea por línea para la reunión del 27/10/2026, con la
  firma de Fressy Mora Peñaranda (Asesoría Legal). Se precisa el trato a
  pacientes, la división de las cargas sociales, el salario bruto, neto y en
  especie, y las salvaguardas de derechos. El cotejo queda sin observaciones;
  las citas a normas pendientes de SCIJ se retiraron del texto y su respaldo
  queda anotado en el archivo.
- R-046 reemplaza a R-001: su nombre es «Kristell Carmona Soto», según su
  propia declaración. Se corrige en el plan y en la plantilla de amonestación.
- N-030: cuotas obrero-patronales de 2026, por verificar con la CCSS y con
  contabilidad.

Co-Authored-By: Claude Opus 5.5 <noreply@anthropic.com>
Claude-Session: https://claude.ai/code/session_01V7BfzBTA8TEWMK1apGBBKC
</commit_message>
<xml_diff>
--- a/casos/laboral-kcarmona/escritos/2026-10-25_Plan_de_Mejora_KCarmona.docx
+++ b/casos/laboral-kcarmona/escritos/2026-10-25_Plan_de_Mejora_KCarmona.docx
@@ -96,7 +96,7 @@
                 <w:color w:val="2F2E47"/>
                 <w:sz w:val="19"/>
               </w:rPr>
-              <w:t>Kristel Carmona Soto</w:t>
+              <w:t>Kristell Carmona Soto</w:t>
             </w:r>
           </w:p>
         </w:tc>
@@ -2755,7 +2755,7 @@
                 <w:color w:val="2F2E47"/>
                 <w:sz w:val="19"/>
               </w:rPr>
-              <w:t>Kristel Carmona Soto</w:t>
+              <w:t>Kristell Carmona Soto</w:t>
             </w:r>
           </w:p>
         </w:tc>

</xml_diff>